<commit_message>
scientifc_literature Phy4 Sript added
</commit_message>
<xml_diff>
--- a/Vorbereitung Bester PhD and PhD lmu ai weather modeling.docx
+++ b/Vorbereitung Bester PhD and PhD lmu ai weather modeling.docx
@@ -4131,85 +4131,124 @@
         <w:t xml:space="preserve"> </w:t>
       </w:r>
     </w:p>
-    <w:p/>
-    <w:p>
-      <w:r>
-        <w:t>-Franz Code lernen (3.)</w:t>
-      </w:r>
-    </w:p>
-    <w:p>
-      <w:r>
-        <w:lastRenderedPageBreak/>
-        <w:t>-</w:t>
-      </w:r>
-      <w:proofErr w:type="spellStart"/>
-      <w:r>
-        <w:t>maybe</w:t>
-      </w:r>
-      <w:proofErr w:type="spellEnd"/>
-      <w:r>
-        <w:t xml:space="preserve"> </w:t>
-      </w:r>
-      <w:proofErr w:type="spellStart"/>
-      <w:r>
-        <w:t>read</w:t>
-      </w:r>
-      <w:proofErr w:type="spellEnd"/>
-      <w:r>
-        <w:t xml:space="preserve"> </w:t>
-      </w:r>
-      <w:proofErr w:type="spellStart"/>
-      <w:r>
-        <w:t>book</w:t>
-      </w:r>
-      <w:proofErr w:type="spellEnd"/>
-      <w:r>
-        <w:t xml:space="preserve"> </w:t>
-      </w:r>
-      <w:proofErr w:type="spellStart"/>
-      <w:r>
-        <w:t>topological</w:t>
-      </w:r>
-      <w:proofErr w:type="spellEnd"/>
-      <w:r>
-        <w:t xml:space="preserve"> </w:t>
-      </w:r>
-      <w:proofErr w:type="spellStart"/>
-      <w:r>
-        <w:t>physes</w:t>
-      </w:r>
-      <w:proofErr w:type="spellEnd"/>
-      <w:r>
-        <w:t xml:space="preserve"> of matter by Roederich Moessner </w:t>
-      </w:r>
-    </w:p>
-    <w:p>
-      <w:r>
-        <w:t xml:space="preserve">Interessante 2d </w:t>
-      </w:r>
-      <w:proofErr w:type="spellStart"/>
-      <w:r>
-        <w:t>materials</w:t>
-      </w:r>
-      <w:proofErr w:type="spellEnd"/>
-      <w:r>
-        <w:t xml:space="preserve"> </w:t>
-      </w:r>
-      <w:proofErr w:type="spellStart"/>
-      <w:r>
-        <w:t>paper</w:t>
-      </w:r>
-      <w:proofErr w:type="spellEnd"/>
-      <w:r>
-        <w:t>:</w:t>
-      </w:r>
-    </w:p>
     <w:p>
       <w:pPr>
         <w:ind w:left="708"/>
       </w:pPr>
       <w:proofErr w:type="spellStart"/>
       <w:r>
+        <w:t>Colorful</w:t>
+      </w:r>
+      <w:proofErr w:type="spellEnd"/>
+      <w:r>
+        <w:t xml:space="preserve"> </w:t>
+      </w:r>
+      <w:proofErr w:type="spellStart"/>
+      <w:r>
+        <w:t>Efficient</w:t>
+      </w:r>
+      <w:proofErr w:type="spellEnd"/>
+      <w:r>
+        <w:t xml:space="preserve"> Moiré-</w:t>
+      </w:r>
+      <w:proofErr w:type="spellStart"/>
+      <w:r>
+        <w:t>Perovskite</w:t>
+      </w:r>
+      <w:proofErr w:type="spellEnd"/>
+      <w:r>
+        <w:t xml:space="preserve"> Solar Cells</w:t>
+      </w:r>
+      <w:r>
+        <w:t xml:space="preserve"> von </w:t>
+      </w:r>
+      <w:r>
+        <w:t xml:space="preserve">Yang Wang et al. (Universität Hamburg hat keinen Zugang dazu) </w:t>
+      </w:r>
+    </w:p>
+    <w:p>
+      <w:pPr>
+        <w:ind w:left="708"/>
+      </w:pPr>
+    </w:p>
+    <w:p/>
+    <w:p>
+      <w:r>
+        <w:t>-Franz Code lernen (3.)</w:t>
+      </w:r>
+    </w:p>
+    <w:p>
+      <w:r>
+        <w:t>-</w:t>
+      </w:r>
+      <w:proofErr w:type="spellStart"/>
+      <w:r>
+        <w:t>maybe</w:t>
+      </w:r>
+      <w:proofErr w:type="spellEnd"/>
+      <w:r>
+        <w:t xml:space="preserve"> </w:t>
+      </w:r>
+      <w:proofErr w:type="spellStart"/>
+      <w:r>
+        <w:t>read</w:t>
+      </w:r>
+      <w:proofErr w:type="spellEnd"/>
+      <w:r>
+        <w:t xml:space="preserve"> </w:t>
+      </w:r>
+      <w:proofErr w:type="spellStart"/>
+      <w:r>
+        <w:t>book</w:t>
+      </w:r>
+      <w:proofErr w:type="spellEnd"/>
+      <w:r>
+        <w:t xml:space="preserve"> </w:t>
+      </w:r>
+      <w:proofErr w:type="spellStart"/>
+      <w:r>
+        <w:t>topological</w:t>
+      </w:r>
+      <w:proofErr w:type="spellEnd"/>
+      <w:r>
+        <w:t xml:space="preserve"> </w:t>
+      </w:r>
+      <w:proofErr w:type="spellStart"/>
+      <w:r>
+        <w:t>physes</w:t>
+      </w:r>
+      <w:proofErr w:type="spellEnd"/>
+      <w:r>
+        <w:t xml:space="preserve"> of matter by Roederich Moessner </w:t>
+      </w:r>
+    </w:p>
+    <w:p>
+      <w:r>
+        <w:t xml:space="preserve">Interessante 2d </w:t>
+      </w:r>
+      <w:proofErr w:type="spellStart"/>
+      <w:r>
+        <w:t>materials</w:t>
+      </w:r>
+      <w:proofErr w:type="spellEnd"/>
+      <w:r>
+        <w:t xml:space="preserve"> </w:t>
+      </w:r>
+      <w:proofErr w:type="spellStart"/>
+      <w:r>
+        <w:t>paper</w:t>
+      </w:r>
+      <w:proofErr w:type="spellEnd"/>
+      <w:r>
+        <w:t>:</w:t>
+      </w:r>
+    </w:p>
+    <w:p>
+      <w:pPr>
+        <w:ind w:left="708"/>
+      </w:pPr>
+      <w:proofErr w:type="spellStart"/>
+      <w:r>
         <w:t>Attosecond</w:t>
       </w:r>
       <w:proofErr w:type="spellEnd"/>
@@ -5010,6 +5049,7 @@
     </w:p>
     <w:p>
       <w:r>
+        <w:lastRenderedPageBreak/>
         <w:t>-</w:t>
       </w:r>
       <w:proofErr w:type="spellStart"/>
@@ -5172,7 +5212,6 @@
     </w:p>
     <w:p>
       <w:r>
-        <w:lastRenderedPageBreak/>
         <w:t xml:space="preserve">-Membranen und Chemie, Katalyse verbinden, </w:t>
       </w:r>
       <w:proofErr w:type="spellStart"/>
@@ -5349,6 +5388,7 @@
     </w:p>
     <w:p>
       <w:r>
+        <w:lastRenderedPageBreak/>
         <w:t>-sehr viel am PhD arbeiten (40-50) h aber kein Burnout (während Arbeitszeit kein Aktivismus) </w:t>
       </w:r>
     </w:p>
@@ -5359,7 +5399,6 @@
     </w:p>
     <w:p>
       <w:r>
-        <w:lastRenderedPageBreak/>
         <w:t xml:space="preserve">-schlau mit KI arbeiten und programmieren (immer erstmal </w:t>
       </w:r>
       <w:proofErr w:type="gramStart"/>
@@ -5591,6 +5630,142 @@
       <w:r>
         <w:t xml:space="preserve">? </w:t>
       </w:r>
+      <w:proofErr w:type="spellStart"/>
+      <w:r>
+        <w:t>Which</w:t>
+      </w:r>
+      <w:proofErr w:type="spellEnd"/>
+      <w:r>
+        <w:t xml:space="preserve"> </w:t>
+      </w:r>
+      <w:proofErr w:type="spellStart"/>
+      <w:r>
+        <w:t>kind</w:t>
+      </w:r>
+      <w:proofErr w:type="spellEnd"/>
+      <w:r>
+        <w:t xml:space="preserve"> of </w:t>
+      </w:r>
+      <w:proofErr w:type="spellStart"/>
+      <w:r>
+        <w:t>excitions</w:t>
+      </w:r>
+      <w:proofErr w:type="spellEnd"/>
+      <w:r>
+        <w:t xml:space="preserve"> </w:t>
+      </w:r>
+      <w:proofErr w:type="spellStart"/>
+      <w:r>
+        <w:t>can</w:t>
+      </w:r>
+      <w:proofErr w:type="spellEnd"/>
+      <w:r>
+        <w:t xml:space="preserve"> </w:t>
+      </w:r>
+      <w:proofErr w:type="spellStart"/>
+      <w:r>
+        <w:t>be</w:t>
+      </w:r>
+      <w:proofErr w:type="spellEnd"/>
+      <w:r>
+        <w:t xml:space="preserve"> </w:t>
+      </w:r>
+      <w:proofErr w:type="spellStart"/>
+      <w:r>
+        <w:t>formed</w:t>
+      </w:r>
+      <w:proofErr w:type="spellEnd"/>
+      <w:r>
+        <w:t xml:space="preserve"> in 2D </w:t>
+      </w:r>
+      <w:proofErr w:type="spellStart"/>
+      <w:r>
+        <w:t>materials</w:t>
+      </w:r>
+      <w:proofErr w:type="spellEnd"/>
+      <w:r>
+        <w:t xml:space="preserve"> and Moiré </w:t>
+      </w:r>
+      <w:proofErr w:type="spellStart"/>
+      <w:r>
+        <w:t>materials</w:t>
+      </w:r>
+      <w:proofErr w:type="spellEnd"/>
+      <w:r>
+        <w:t xml:space="preserve">? </w:t>
+      </w:r>
+      <w:proofErr w:type="gramStart"/>
+      <w:r>
+        <w:t>In</w:t>
+      </w:r>
+      <w:proofErr w:type="gramEnd"/>
+      <w:r>
+        <w:t xml:space="preserve"> </w:t>
+      </w:r>
+      <w:proofErr w:type="spellStart"/>
+      <w:r>
+        <w:t>which</w:t>
+      </w:r>
+      <w:proofErr w:type="spellEnd"/>
+      <w:r>
+        <w:t xml:space="preserve"> (2D) </w:t>
+      </w:r>
+      <w:proofErr w:type="spellStart"/>
+      <w:r>
+        <w:t>materials</w:t>
+      </w:r>
+      <w:proofErr w:type="spellEnd"/>
+      <w:r>
+        <w:t xml:space="preserve"> </w:t>
+      </w:r>
+      <w:proofErr w:type="spellStart"/>
+      <w:r>
+        <w:t>have</w:t>
+      </w:r>
+      <w:proofErr w:type="spellEnd"/>
+      <w:r>
+        <w:t xml:space="preserve"> </w:t>
+      </w:r>
+      <w:proofErr w:type="spellStart"/>
+      <w:r>
+        <w:t>excitons</w:t>
+      </w:r>
+      <w:proofErr w:type="spellEnd"/>
+      <w:r>
+        <w:t xml:space="preserve"> </w:t>
+      </w:r>
+      <w:proofErr w:type="spellStart"/>
+      <w:r>
+        <w:t>already</w:t>
+      </w:r>
+      <w:proofErr w:type="spellEnd"/>
+      <w:r>
+        <w:t xml:space="preserve"> </w:t>
+      </w:r>
+      <w:proofErr w:type="spellStart"/>
+      <w:r>
+        <w:t>been</w:t>
+      </w:r>
+      <w:proofErr w:type="spellEnd"/>
+      <w:r>
+        <w:t xml:space="preserve"> </w:t>
+      </w:r>
+      <w:proofErr w:type="spellStart"/>
+      <w:r>
+        <w:t>modelled</w:t>
+      </w:r>
+      <w:proofErr w:type="spellEnd"/>
+      <w:r>
+        <w:t xml:space="preserve"> and </w:t>
+      </w:r>
+      <w:proofErr w:type="spellStart"/>
+      <w:r>
+        <w:t>how</w:t>
+      </w:r>
+      <w:proofErr w:type="spellEnd"/>
+      <w:r>
+        <w:t xml:space="preserve">? </w:t>
+      </w:r>
     </w:p>
     <w:p>
       <w:r>
@@ -6127,6 +6302,11 @@
       </w:r>
     </w:p>
     <w:p>
+      <w:r>
+        <w:t xml:space="preserve">8. </w:t>
+      </w:r>
+    </w:p>
+    <w:p>
       <w:pPr>
         <w:rPr>
           <w:b/>
@@ -6272,6 +6452,7 @@
     </w:p>
     <w:p>
       <w:r>
+        <w:lastRenderedPageBreak/>
         <w:t>-</w:t>
       </w:r>
       <w:r>
@@ -7489,7 +7670,6 @@
   <w:style w:type="character" w:default="1" w:styleId="Absatz-Standardschriftart">
     <w:name w:val="Default Paragraph Font"/>
     <w:uiPriority w:val="1"/>
-    <w:semiHidden/>
     <w:unhideWhenUsed/>
   </w:style>
   <w:style w:type="table" w:default="1" w:styleId="NormaleTabelle">

</xml_diff>